<commit_message>
docs: actualizar cierre formal y politica de repositorio
</commit_message>
<xml_diff>
--- a/docs/0. Documentación del Cliente/0. Desarrollo de Sistema de Gestión de Riesgos 2024-Agosto.docx
+++ b/docs/0. Documentación del Cliente/0. Desarrollo de Sistema de Gestión de Riesgos 2024-Agosto.docx
@@ -3603,7 +3603,7 @@
           <w:szCs w:val="20"/>
           <w:lang w:eastAsia="es-HN"/>
         </w:rPr>
-        <w:t>: Identificacion y calificacion del riesgo</w:t>
+        <w:t>: Identificacion y calificación del riesgo</w:t>
       </w:r>
     </w:p>
     <w:p>
@@ -6317,7 +6317,7 @@
           <w:szCs w:val="20"/>
           <w:lang w:val="es-ES"/>
         </w:rPr>
-        <w:t xml:space="preserve">Este módulo debe ser manejado como lo detallado en Modulo de Monitoreo de Listas, en donde se pueda identificar la empresa </w:t>
+        <w:t xml:space="preserve">Este módulo debe ser manejado como lo detallado en Módulo de Monitoreo de Listas, en donde se pueda identificar la empresa </w:t>
       </w:r>
       <w:r>
         <w:rPr>
@@ -8417,6 +8417,7 @@
     </w:p>
     <w:sectPr>
       <w:footerReference w:type="default" r:id="rId18"/>
+      <w:headerReference w:type="default" r:id="rId21"/>
       <w:pgSz w:w="12242" w:h="15842" w:code="1"/>
       <w:pgMar w:top="1417" w:right="1701" w:bottom="709" w:left="1701" w:header="709" w:footer="709" w:gutter="0"/>
       <w:cols w:space="708"/>
@@ -8521,6 +8522,16 @@
     </w:p>
   </w:footnote>
 </w:footnotes>
+</file>
+
+<file path=word/header1.xml><?xml version="1.0" encoding="utf-8"?>
+<w:hdr xmlns:m="http://schemas.openxmlformats.org/officeDocument/2006/math" xmlns:mc="http://schemas.openxmlformats.org/markup-compatibility/2006" xmlns:mo="http://schemas.microsoft.com/office/mac/office/2008/main" xmlns:mv="urn:schemas-microsoft-com:mac:vml" xmlns:o="urn:schemas-microsoft-com:office:office" xmlns:r="http://schemas.openxmlformats.org/officeDocument/2006/relationships" xmlns:v="urn:schemas-microsoft-com:vml" xmlns:w10="urn:schemas-microsoft-com:office:word" xmlns:w14="http://schemas.microsoft.com/office/word/2010/wordml" xmlns:w="http://schemas.openxmlformats.org/wordprocessingml/2006/main" xmlns:wne="http://schemas.microsoft.com/office/word/2006/wordml" xmlns:wp14="http://schemas.microsoft.com/office/word/2010/wordprocessingDrawing" xmlns:wp="http://schemas.openxmlformats.org/drawingml/2006/wordprocessingDrawing" xmlns:wpc="http://schemas.microsoft.com/office/word/2010/wordprocessingCanvas" xmlns:wpg="http://schemas.microsoft.com/office/word/2010/wordprocessingGroup" xmlns:wpi="http://schemas.microsoft.com/office/word/2010/wordprocessingInk" xmlns:wps="http://schemas.microsoft.com/office/word/2010/wordprocessingShape" mc:Ignorable="w14 wp14">
+  <w:p>
+    <w:pPr>
+      <w:pStyle w:val="Header"/>
+    </w:pPr>
+  </w:p>
+</w:hdr>
 </file>
 
 <file path=word/numbering.xml><?xml version="1.0" encoding="utf-8"?>

</xml_diff>

<commit_message>
refactor: completar fase 4 del backend
</commit_message>
<xml_diff>
--- a/docs/0. Documentación del Cliente/0. Desarrollo de Sistema de Gestión de Riesgos 2024-Agosto.docx
+++ b/docs/0. Documentación del Cliente/0. Desarrollo de Sistema de Gestión de Riesgos 2024-Agosto.docx
@@ -1174,8 +1174,6 @@
         </w:rPr>
         <w:t>Módulo de Indicadores de Riesgos</w:t>
       </w:r>
-      <w:bookmarkStart w:id="0" w:name="_GoBack"/>
-      <w:bookmarkEnd w:id="0"/>
     </w:p>
     <w:p>
       <w:pPr>
@@ -1229,9 +1227,6 @@
     </w:p>
     <w:p>
       <w:pPr>
-        <w:pStyle w:val="Prrafodelista"/>
-        <w:ind w:left="360"/>
-        <w:jc w:val="both"/>
         <w:rPr>
           <w:rFonts w:cstheme="minorHAnsi"/>
           <w:sz w:val="20"/>
@@ -1240,6 +1235,16 @@
           <w:lang w:val="es-ES"/>
         </w:rPr>
       </w:pPr>
+      <w:r>
+        <w:rPr>
+          <w:rFonts w:cstheme="minorHAnsi"/>
+          <w:sz w:val="20"/>
+          <w:szCs w:val="20"/>
+          <w:highlight w:val="yellow"/>
+          <w:lang w:val="es-ES"/>
+        </w:rPr>
+        <w:br w:type="page"/>
+      </w:r>
     </w:p>
     <w:p>
       <w:pPr>
@@ -1266,6 +1271,7 @@
           <w:u w:val="single"/>
           <w:lang w:val="es-ES"/>
         </w:rPr>
+        <w:lastRenderedPageBreak/>
         <w:t>MÓDULO DE</w:t>
       </w:r>
       <w:r>
@@ -1397,7 +1403,6 @@
           <w:szCs w:val="20"/>
           <w:lang w:val="es-ES"/>
         </w:rPr>
-        <w:lastRenderedPageBreak/>
         <w:t>Este módulo</w:t>
       </w:r>
       <w:r>
@@ -1671,7 +1676,7 @@
           <w:noProof/>
           <w:sz w:val="20"/>
           <w:szCs w:val="20"/>
-          <w:lang w:eastAsia="es-HN"/>
+          <w:lang w:val="es-419" w:eastAsia="es-419"/>
         </w:rPr>
         <mc:AlternateContent>
           <mc:Choice Requires="wps">
@@ -1769,7 +1774,7 @@
           <w:noProof/>
           <w:sz w:val="20"/>
           <w:szCs w:val="20"/>
-          <w:lang w:eastAsia="es-HN"/>
+          <w:lang w:val="es-419" w:eastAsia="es-419"/>
         </w:rPr>
         <mc:AlternateContent>
           <mc:Choice Requires="wps">
@@ -2000,7 +2005,7 @@
           <w:noProof/>
           <w:sz w:val="20"/>
           <w:szCs w:val="20"/>
-          <w:lang w:eastAsia="es-HN"/>
+          <w:lang w:val="es-419" w:eastAsia="es-419"/>
         </w:rPr>
         <mc:AlternateContent>
           <mc:Choice Requires="wps">
@@ -2115,7 +2120,7 @@
           <w:noProof/>
           <w:sz w:val="20"/>
           <w:szCs w:val="20"/>
-          <w:lang w:eastAsia="es-HN"/>
+          <w:lang w:val="es-419" w:eastAsia="es-419"/>
         </w:rPr>
         <mc:AlternateContent>
           <mc:Choice Requires="wps">
@@ -2250,7 +2255,7 @@
           <w:noProof/>
           <w:sz w:val="20"/>
           <w:szCs w:val="20"/>
-          <w:lang w:eastAsia="es-HN"/>
+          <w:lang w:val="es-419" w:eastAsia="es-419"/>
         </w:rPr>
         <mc:AlternateContent>
           <mc:Choice Requires="wps">
@@ -2375,7 +2380,7 @@
           <w:noProof/>
           <w:sz w:val="20"/>
           <w:szCs w:val="20"/>
-          <w:lang w:eastAsia="es-HN"/>
+          <w:lang w:val="es-419" w:eastAsia="es-419"/>
         </w:rPr>
         <mc:AlternateContent>
           <mc:Choice Requires="wps">
@@ -2499,7 +2504,7 @@
           <w:noProof/>
           <w:sz w:val="20"/>
           <w:szCs w:val="20"/>
-          <w:lang w:eastAsia="es-HN"/>
+          <w:lang w:val="es-419" w:eastAsia="es-419"/>
         </w:rPr>
         <mc:AlternateContent>
           <mc:Choice Requires="wps">
@@ -2631,7 +2636,7 @@
           <w:noProof/>
           <w:sz w:val="20"/>
           <w:szCs w:val="20"/>
-          <w:lang w:eastAsia="es-HN"/>
+          <w:lang w:val="es-419" w:eastAsia="es-419"/>
         </w:rPr>
         <mc:AlternateContent>
           <mc:Choice Requires="wps">
@@ -2848,7 +2853,7 @@
           <w:noProof/>
           <w:sz w:val="20"/>
           <w:szCs w:val="20"/>
-          <w:lang w:eastAsia="es-HN"/>
+          <w:lang w:val="es-419" w:eastAsia="es-419"/>
         </w:rPr>
         <mc:AlternateContent>
           <mc:Choice Requires="wps">
@@ -3623,7 +3628,7 @@
           <w:noProof/>
           <w:sz w:val="20"/>
           <w:szCs w:val="20"/>
-          <w:lang w:eastAsia="es-HN"/>
+          <w:lang w:val="es-419" w:eastAsia="es-419"/>
         </w:rPr>
         <w:drawing>
           <wp:inline distT="0" distB="0" distL="0" distR="0" wp14:anchorId="61A0379F" wp14:editId="7196A254">
@@ -3729,7 +3734,7 @@
           <w:noProof/>
           <w:sz w:val="20"/>
           <w:szCs w:val="20"/>
-          <w:lang w:eastAsia="es-HN"/>
+          <w:lang w:val="es-419" w:eastAsia="es-419"/>
         </w:rPr>
         <w:drawing>
           <wp:inline distT="0" distB="0" distL="0" distR="0" wp14:anchorId="47251AC1" wp14:editId="2C19E074">
@@ -3826,7 +3831,7 @@
           <w:noProof/>
           <w:sz w:val="20"/>
           <w:szCs w:val="20"/>
-          <w:lang w:eastAsia="es-HN"/>
+          <w:lang w:val="es-419" w:eastAsia="es-419"/>
         </w:rPr>
         <w:drawing>
           <wp:inline distT="0" distB="0" distL="0" distR="0" wp14:anchorId="149064EE" wp14:editId="2AAAB3F3">
@@ -3924,7 +3929,7 @@
       <w:r>
         <w:rPr>
           <w:noProof/>
-          <w:lang w:eastAsia="es-HN"/>
+          <w:lang w:val="es-419" w:eastAsia="es-419"/>
         </w:rPr>
         <mc:AlternateContent>
           <mc:Choice Requires="wps">
@@ -4024,7 +4029,7 @@
           <w:noProof/>
           <w:sz w:val="20"/>
           <w:szCs w:val="20"/>
-          <w:lang w:eastAsia="es-HN"/>
+          <w:lang w:val="es-419" w:eastAsia="es-419"/>
         </w:rPr>
         <w:lastRenderedPageBreak/>
         <w:drawing>
@@ -4093,7 +4098,7 @@
       <w:r>
         <w:rPr>
           <w:noProof/>
-          <w:lang w:eastAsia="es-HN"/>
+          <w:lang w:val="es-419" w:eastAsia="es-419"/>
         </w:rPr>
         <mc:AlternateContent>
           <mc:Choice Requires="wps">
@@ -4180,7 +4185,7 @@
           <w:noProof/>
           <w:sz w:val="20"/>
           <w:szCs w:val="20"/>
-          <w:lang w:eastAsia="es-HN"/>
+          <w:lang w:val="es-419" w:eastAsia="es-419"/>
         </w:rPr>
         <w:drawing>
           <wp:inline distT="0" distB="0" distL="0" distR="0">
@@ -4237,16 +4242,22 @@
     </w:p>
     <w:p>
       <w:pPr>
-        <w:pStyle w:val="Prrafodelista"/>
-        <w:ind w:left="360"/>
-        <w:jc w:val="both"/>
-        <w:rPr>
-          <w:rFonts w:cstheme="minorHAnsi"/>
-          <w:sz w:val="20"/>
-          <w:szCs w:val="20"/>
-          <w:lang w:val="es-ES"/>
-        </w:rPr>
-      </w:pPr>
+        <w:rPr>
+          <w:rFonts w:cstheme="minorHAnsi"/>
+          <w:sz w:val="20"/>
+          <w:szCs w:val="20"/>
+          <w:lang w:val="es-ES"/>
+        </w:rPr>
+      </w:pPr>
+      <w:r>
+        <w:rPr>
+          <w:rFonts w:cstheme="minorHAnsi"/>
+          <w:sz w:val="20"/>
+          <w:szCs w:val="20"/>
+          <w:lang w:val="es-ES"/>
+        </w:rPr>
+        <w:br w:type="page"/>
+      </w:r>
     </w:p>
     <w:p>
       <w:pPr>
@@ -4272,6 +4283,7 @@
           <w:u w:val="single"/>
           <w:lang w:val="es-ES"/>
         </w:rPr>
+        <w:lastRenderedPageBreak/>
         <w:t>Perfilamiento de los factores de riesgo</w:t>
       </w:r>
       <w:r>
@@ -4346,7 +4358,6 @@
           <w:szCs w:val="20"/>
           <w:lang w:val="es-ES"/>
         </w:rPr>
-        <w:lastRenderedPageBreak/>
         <w:t>Son en general 3 factores de riesgo: Cliente</w:t>
       </w:r>
       <w:r>
@@ -4642,7 +4653,7 @@
           <w:noProof/>
           <w:sz w:val="20"/>
           <w:szCs w:val="20"/>
-          <w:lang w:eastAsia="es-HN"/>
+          <w:lang w:val="es-419" w:eastAsia="es-419"/>
         </w:rPr>
         <w:drawing>
           <wp:inline distT="0" distB="0" distL="0" distR="0" wp14:anchorId="7D3B9C91">
@@ -4837,7 +4848,7 @@
           <w:noProof/>
           <w:sz w:val="20"/>
           <w:szCs w:val="20"/>
-          <w:lang w:eastAsia="es-HN"/>
+          <w:lang w:val="es-419" w:eastAsia="es-419"/>
         </w:rPr>
         <w:drawing>
           <wp:inline distT="0" distB="0" distL="0" distR="0">
@@ -4985,6 +4996,7 @@
           <w:szCs w:val="20"/>
           <w:lang w:val="es-ES"/>
         </w:rPr>
+        <w:lastRenderedPageBreak/>
         <w:t>Este deberá arrojar un reporte que contenga la calificación de riesgos de cada uno de los clientes empleados y proveedores, deberá ser dinámico para analizar los números desde diferentes ángulos.</w:t>
       </w:r>
     </w:p>
@@ -5004,7 +5016,6 @@
           <w:sz w:val="20"/>
           <w:szCs w:val="20"/>
         </w:rPr>
-        <w:lastRenderedPageBreak/>
         <w:t>En esta matriz debería vaciarse la explotación de datos del sistema, eso significa que debe depositarse los resultados de las variables aplicadas a cada patrono:</w:t>
       </w:r>
     </w:p>
@@ -5060,7 +5071,7 @@
           <w:noProof/>
           <w:sz w:val="20"/>
           <w:szCs w:val="20"/>
-          <w:lang w:eastAsia="es-HN"/>
+          <w:lang w:val="es-419" w:eastAsia="es-419"/>
         </w:rPr>
         <w:drawing>
           <wp:inline distT="0" distB="0" distL="0" distR="0" wp14:anchorId="1EB0B374" wp14:editId="7BE136C3">
@@ -5151,7 +5162,7 @@
           <w:noProof/>
           <w:sz w:val="20"/>
           <w:szCs w:val="20"/>
-          <w:lang w:eastAsia="es-HN"/>
+          <w:lang w:val="es-419" w:eastAsia="es-419"/>
         </w:rPr>
         <w:drawing>
           <wp:inline distT="0" distB="0" distL="0" distR="0" wp14:anchorId="5AF451FA" wp14:editId="69F9D915">
@@ -5208,16 +5219,22 @@
     </w:p>
     <w:p>
       <w:pPr>
-        <w:pStyle w:val="Prrafodelista"/>
-        <w:ind w:left="360"/>
-        <w:jc w:val="both"/>
-        <w:rPr>
-          <w:rFonts w:cstheme="minorHAnsi"/>
-          <w:sz w:val="20"/>
-          <w:szCs w:val="20"/>
-          <w:lang w:val="es-ES"/>
-        </w:rPr>
-      </w:pPr>
+        <w:rPr>
+          <w:rFonts w:cstheme="minorHAnsi"/>
+          <w:sz w:val="20"/>
+          <w:szCs w:val="20"/>
+          <w:lang w:val="es-ES"/>
+        </w:rPr>
+      </w:pPr>
+      <w:r>
+        <w:rPr>
+          <w:rFonts w:cstheme="minorHAnsi"/>
+          <w:sz w:val="20"/>
+          <w:szCs w:val="20"/>
+          <w:lang w:val="es-ES"/>
+        </w:rPr>
+        <w:br w:type="page"/>
+      </w:r>
     </w:p>
     <w:p>
       <w:pPr>
@@ -5243,6 +5260,7 @@
           <w:u w:val="single"/>
           <w:lang w:val="es-ES"/>
         </w:rPr>
+        <w:lastRenderedPageBreak/>
         <w:t>Matriz de Calificación de riesgo (</w:t>
       </w:r>
       <w:r>
@@ -5361,7 +5379,7 @@
           <w:noProof/>
           <w:sz w:val="20"/>
           <w:szCs w:val="20"/>
-          <w:lang w:eastAsia="es-HN"/>
+          <w:lang w:val="es-419" w:eastAsia="es-419"/>
         </w:rPr>
         <w:drawing>
           <wp:inline distT="0" distB="0" distL="0" distR="0">
@@ -5986,8 +6004,9 @@
           <w:noProof/>
           <w:sz w:val="20"/>
           <w:szCs w:val="20"/>
-          <w:lang w:eastAsia="es-HN"/>
-        </w:rPr>
+          <w:lang w:val="es-419" w:eastAsia="es-419"/>
+        </w:rPr>
+        <w:lastRenderedPageBreak/>
         <w:drawing>
           <wp:inline distT="0" distB="0" distL="0" distR="0" wp14:anchorId="20F2833F" wp14:editId="457452EC">
             <wp:extent cx="3514476" cy="1980792"/>
@@ -6266,7 +6285,6 @@
           <w:szCs w:val="20"/>
           <w:lang w:val="es-ES"/>
         </w:rPr>
-        <w:lastRenderedPageBreak/>
         <w:br w:type="page"/>
       </w:r>
     </w:p>
@@ -6476,7 +6494,7 @@
           <w:noProof/>
           <w:sz w:val="20"/>
           <w:szCs w:val="20"/>
-          <w:lang w:eastAsia="es-HN"/>
+          <w:lang w:val="es-419" w:eastAsia="es-419"/>
         </w:rPr>
         <mc:AlternateContent>
           <mc:Choice Requires="wps">
@@ -6603,7 +6621,7 @@
           <w:noProof/>
           <w:sz w:val="20"/>
           <w:szCs w:val="20"/>
-          <w:lang w:eastAsia="es-HN"/>
+          <w:lang w:val="es-419" w:eastAsia="es-419"/>
         </w:rPr>
         <mc:AlternateContent>
           <mc:Choice Requires="wps">
@@ -6738,7 +6756,7 @@
           <w:noProof/>
           <w:sz w:val="20"/>
           <w:szCs w:val="20"/>
-          <w:lang w:eastAsia="es-HN"/>
+          <w:lang w:val="es-419" w:eastAsia="es-419"/>
         </w:rPr>
         <mc:AlternateContent>
           <mc:Choice Requires="wps">
@@ -6855,7 +6873,7 @@
           <w:noProof/>
           <w:sz w:val="20"/>
           <w:szCs w:val="20"/>
-          <w:lang w:eastAsia="es-HN"/>
+          <w:lang w:val="es-419" w:eastAsia="es-419"/>
         </w:rPr>
         <mc:AlternateContent>
           <mc:Choice Requires="wps">
@@ -6970,7 +6988,7 @@
           <w:noProof/>
           <w:sz w:val="20"/>
           <w:szCs w:val="20"/>
-          <w:lang w:eastAsia="es-HN"/>
+          <w:lang w:val="es-419" w:eastAsia="es-419"/>
         </w:rPr>
         <mc:AlternateContent>
           <mc:Choice Requires="wps">
@@ -7085,7 +7103,7 @@
           <w:noProof/>
           <w:sz w:val="20"/>
           <w:szCs w:val="20"/>
-          <w:lang w:eastAsia="es-HN"/>
+          <w:lang w:val="es-419" w:eastAsia="es-419"/>
         </w:rPr>
         <mc:AlternateContent>
           <mc:Choice Requires="wps">
@@ -7183,7 +7201,7 @@
           <w:noProof/>
           <w:sz w:val="20"/>
           <w:szCs w:val="20"/>
-          <w:lang w:eastAsia="es-HN"/>
+          <w:lang w:val="es-419" w:eastAsia="es-419"/>
         </w:rPr>
         <mc:AlternateContent>
           <mc:Choice Requires="wps">
@@ -7310,7 +7328,7 @@
           <w:noProof/>
           <w:sz w:val="20"/>
           <w:szCs w:val="20"/>
-          <w:lang w:eastAsia="es-HN"/>
+          <w:lang w:val="es-419" w:eastAsia="es-419"/>
         </w:rPr>
         <mc:AlternateContent>
           <mc:Choice Requires="wps">
@@ -7429,7 +7447,7 @@
           <w:noProof/>
           <w:sz w:val="20"/>
           <w:szCs w:val="20"/>
-          <w:lang w:eastAsia="es-HN"/>
+          <w:lang w:val="es-419" w:eastAsia="es-419"/>
         </w:rPr>
         <mc:AlternateContent>
           <mc:Choice Requires="wps">
@@ -7554,7 +7572,7 @@
           <w:noProof/>
           <w:sz w:val="20"/>
           <w:szCs w:val="20"/>
-          <w:lang w:eastAsia="es-HN"/>
+          <w:lang w:val="es-419" w:eastAsia="es-419"/>
         </w:rPr>
         <mc:AlternateContent>
           <mc:Choice Requires="wps">
@@ -7672,7 +7690,7 @@
           <w:noProof/>
           <w:sz w:val="20"/>
           <w:szCs w:val="20"/>
-          <w:lang w:eastAsia="es-HN"/>
+          <w:lang w:val="es-419" w:eastAsia="es-419"/>
         </w:rPr>
         <mc:AlternateContent>
           <mc:Choice Requires="wps">
@@ -7796,7 +7814,7 @@
           <w:noProof/>
           <w:sz w:val="20"/>
           <w:szCs w:val="20"/>
-          <w:lang w:eastAsia="es-HN"/>
+          <w:lang w:val="es-419" w:eastAsia="es-419"/>
         </w:rPr>
         <mc:AlternateContent>
           <mc:Choice Requires="wps">
@@ -7928,7 +7946,7 @@
           <w:noProof/>
           <w:sz w:val="20"/>
           <w:szCs w:val="20"/>
-          <w:lang w:eastAsia="es-HN"/>
+          <w:lang w:val="es-419" w:eastAsia="es-419"/>
         </w:rPr>
         <mc:AlternateContent>
           <mc:Choice Requires="wps">
@@ -8068,7 +8086,7 @@
           <w:noProof/>
           <w:sz w:val="20"/>
           <w:szCs w:val="20"/>
-          <w:lang w:eastAsia="es-HN"/>
+          <w:lang w:val="es-419" w:eastAsia="es-419"/>
         </w:rPr>
         <mc:AlternateContent>
           <mc:Choice Requires="wps">
@@ -8392,6 +8410,8 @@
           <w:lang w:val="es-ES"/>
         </w:rPr>
       </w:pPr>
+      <w:bookmarkStart w:id="0" w:name="_GoBack"/>
+      <w:bookmarkEnd w:id="0"/>
     </w:p>
     <w:p>
       <w:pPr>
@@ -8416,8 +8436,8 @@
       </w:r>
     </w:p>
     <w:sectPr>
-      <w:footerReference w:type="default" r:id="rId18"/>
-      <w:headerReference w:type="default" r:id="rId21"/>
+      <w:headerReference w:type="default" r:id="rId18"/>
+      <w:footerReference w:type="default" r:id="rId19"/>
       <w:pgSz w:w="12242" w:h="15842" w:code="1"/>
       <w:pgMar w:top="1417" w:right="1701" w:bottom="709" w:left="1701" w:header="709" w:footer="709" w:gutter="0"/>
       <w:cols w:space="708"/>
@@ -8483,7 +8503,7 @@
             <w:noProof/>
             <w:lang w:val="es-ES"/>
           </w:rPr>
-          <w:t>8</w:t>
+          <w:t>9</w:t>
         </w:r>
         <w:r>
           <w:fldChar w:fldCharType="end"/>
@@ -8525,12 +8545,8 @@
 </file>
 
 <file path=word/header1.xml><?xml version="1.0" encoding="utf-8"?>
-<w:hdr xmlns:m="http://schemas.openxmlformats.org/officeDocument/2006/math" xmlns:mc="http://schemas.openxmlformats.org/markup-compatibility/2006" xmlns:mo="http://schemas.microsoft.com/office/mac/office/2008/main" xmlns:mv="urn:schemas-microsoft-com:mac:vml" xmlns:o="urn:schemas-microsoft-com:office:office" xmlns:r="http://schemas.openxmlformats.org/officeDocument/2006/relationships" xmlns:v="urn:schemas-microsoft-com:vml" xmlns:w10="urn:schemas-microsoft-com:office:word" xmlns:w14="http://schemas.microsoft.com/office/word/2010/wordml" xmlns:w="http://schemas.openxmlformats.org/wordprocessingml/2006/main" xmlns:wne="http://schemas.microsoft.com/office/word/2006/wordml" xmlns:wp14="http://schemas.microsoft.com/office/word/2010/wordprocessingDrawing" xmlns:wp="http://schemas.openxmlformats.org/drawingml/2006/wordprocessingDrawing" xmlns:wpc="http://schemas.microsoft.com/office/word/2010/wordprocessingCanvas" xmlns:wpg="http://schemas.microsoft.com/office/word/2010/wordprocessingGroup" xmlns:wpi="http://schemas.microsoft.com/office/word/2010/wordprocessingInk" xmlns:wps="http://schemas.microsoft.com/office/word/2010/wordprocessingShape" mc:Ignorable="w14 wp14">
-  <w:p>
-    <w:pPr>
-      <w:pStyle w:val="Header"/>
-    </w:pPr>
-  </w:p>
+<w:hdr xmlns:wpc="http://schemas.microsoft.com/office/word/2010/wordprocessingCanvas" xmlns:mc="http://schemas.openxmlformats.org/markup-compatibility/2006" xmlns:o="urn:schemas-microsoft-com:office:office" xmlns:r="http://schemas.openxmlformats.org/officeDocument/2006/relationships" xmlns:m="http://schemas.openxmlformats.org/officeDocument/2006/math" xmlns:v="urn:schemas-microsoft-com:vml" xmlns:wp14="http://schemas.microsoft.com/office/word/2010/wordprocessingDrawing" xmlns:wp="http://schemas.openxmlformats.org/drawingml/2006/wordprocessingDrawing" xmlns:w10="urn:schemas-microsoft-com:office:word" xmlns:w="http://schemas.openxmlformats.org/wordprocessingml/2006/main" xmlns:w14="http://schemas.microsoft.com/office/word/2010/wordml" xmlns:w15="http://schemas.microsoft.com/office/word/2012/wordml" xmlns:wpg="http://schemas.microsoft.com/office/word/2010/wordprocessingGroup" xmlns:wpi="http://schemas.microsoft.com/office/word/2010/wordprocessingInk" xmlns:wne="http://schemas.microsoft.com/office/word/2006/wordml" xmlns:wps="http://schemas.microsoft.com/office/word/2010/wordprocessingShape" mc:Ignorable="w14 w15 wp14">
+  <w:p/>
 </w:hdr>
 </file>
 
@@ -8557,7 +8573,7 @@
         <v:path o:extrusionok="f" gradientshapeok="t" o:connecttype="rect"/>
         <o:lock v:ext="edit" aspectratio="t"/>
       </v:shapetype>
-      <v:shape id="_x0000_i1031" type="#_x0000_t75" style="width:11.85pt;height:11.85pt" o:bullet="t">
+      <v:shape id="_x0000_i1027" type="#_x0000_t75" style="width:11.9pt;height:11.9pt" o:bullet="t">
         <v:imagedata r:id="rId1" o:title="mso119"/>
       </v:shape>
     </w:pict>

</xml_diff>